<commit_message>
Porttikorjaukset: Linnea r2, Wilhelm ja Börje
Vko 41 rajattu resurssipakettiin, reseptin versiohuomautus 1.21-1.21.2,
Börjen 38 kielikorjausta, semanttiset täsmennykset (T09, AI-loki,
itsearviointi) ja lataukset generoitu lopullisista teksteistä.

Co-Authored-By: Claude Fable 5 <noreply@anthropic.com>
</commit_message>
<xml_diff>
--- a/downloads/bittibiomi-tyopaketti.docx
+++ b/downloads/bittibiomi-tyopaketti.docx
@@ -1918,7 +1918,7 @@
           <w:sz w:val="21"/>
           <w:szCs w:val="21"/>
         </w:rPr>
-        <w:t xml:space="preserve">☐  Täytä Asset-pack-suunnitelman omat päätökset tällä sivulla (mm. teema ja kohde omin sanoin) ja vie ladattu asset-pack-suunnitelma.md repositorion project-docs-kansioon.</w:t>
+        <w:t xml:space="preserve">☐  Täytä Asset-pack-suunnitelman omat päätökset sivustolla (mm. teema ja kohde omin sanoin) ja vie ladattu asset-pack-suunnitelma.md repositoryn project-docs-kansioon.</w:t>
       </w:r>
     </w:p>
     <w:p>
@@ -2919,7 +2919,7 @@
           <w:sz w:val="19"/>
           <w:szCs w:val="19"/>
         </w:rPr>
-        <w:t xml:space="preserve">Valmis kun: Sama testi läpäisee ennen ja jälkeen siivouksen. Katselmointikommenttiin on vastattu, ja README listaa jokaisen ulkopuolisen lähteen lisensseineen — tai toteaa, että kaikki on itse tehtyä.</w:t>
+        <w:t xml:space="preserve">Valmis kun: Sama testi menee läpi ennen siivousta ja sen jälkeen. Katselmointikommenttiin on vastattu, ja README listaa jokaisen ulkopuolisen lähteen lisensseineen — tai toteaa, että kaikki on itse tehtyä.</w:t>
       </w:r>
     </w:p>
     <w:p>
@@ -2999,7 +2999,7 @@
           <w:sz w:val="21"/>
           <w:szCs w:val="21"/>
         </w:rPr>
-        <w:t xml:space="preserve">☐  Anna asiakkaan ja vähintään yhden muun käyttäjän asentaa ja testata paketti pelkän ohjeen avulla. Yksin tehdessä toinen testaaja voi olla toisen ryhmän opiskelija tai ohjaaja.</w:t>
+        <w:t xml:space="preserve">☐  Anna asiakkaan ja vähintään yhden muun käyttäjän asentaa ja testata paketti pelkän ohjeen avulla. Jos teet yksin, toinen testaaja voi olla toisen ryhmän opiskelija tai ohjaaja.</w:t>
       </w:r>
     </w:p>
     <w:p>
@@ -3169,7 +3169,7 @@
           <w:sz w:val="21"/>
           <w:szCs w:val="21"/>
         </w:rPr>
-        <w:t xml:space="preserve">☐  Tarkista kaikkien viikkojen projektipäiväkirja ja vie valmis tiedosto repositorion project-docs-kansioon.</w:t>
+        <w:t xml:space="preserve">☐  Tarkista kaikkien viikkojen projektipäiväkirja ja vie valmis tiedosto repositoryn project-docs-kansioon.</w:t>
       </w:r>
     </w:p>
     <w:p>
@@ -3390,7 +3390,7 @@
           <w:sz w:val="19"/>
           <w:szCs w:val="19"/>
         </w:rPr>
-        <w:t xml:space="preserve">☐  Virheenkorjaus — Kolme täydellistä ketjua aidoista havainnoista tai opettajan merkityistä vikatehtävistä.</w:t>
+        <w:t xml:space="preserve">☐  Virheenkorjaus — Kolme täydellistä ketjua aidoista havainnoista tai opettajan merkitsemistä vikatehtävistä.</w:t>
       </w:r>
     </w:p>
     <w:p>
@@ -3718,7 +3718,7 @@
           <w:sz w:val="19"/>
           <w:szCs w:val="19"/>
         </w:rPr>
-        <w:t xml:space="preserve">☐  Kirjaston mahdollisuudet ja rajoitteet — Viikon 45 kirjaus paketti­järjestelmän rajoituksista ja viikon 48 julkaisupäätökset tunnettuine puutteineen.</w:t>
+        <w:t xml:space="preserve">☐  Kirjaston mahdollisuudet ja rajoitteet — Viikon 45 kirjaus pakettijärjestelmän rajoituksista ja viikon 48 julkaisupäätökset tunnettuine puutteineen.</w:t>
       </w:r>
     </w:p>
     <w:p>

</xml_diff>

<commit_message>
Vaihda kehys: avoimen lähdekoodin paketti sisäisen tilaajan sijaan
Toimeksianto: julkaistava avoin teemapaketti, julkinen repository
ensimmäisestä commitista, avoin lisenssi. Toimeksiantaja on ohjaaja,
kohdeyleisö kuka tahansa lataaja; katselmoinnit ohjaajan ja
vertaistestaajan kanssa.

- lisenssivalinta Asset-pack-suunnitelmaan (CC BY / CC BY-SA / CC0 / MIT)
- LICENSE ja CREDITS viikolle 46, CHANGELOG julkaisuun viikolla 48
- kolmansien osapuolten materiaali vain uudelleenjulkaisun sallivalla lisenssillä
- lisenssikirjauspohja dokumentointipohjiin, lataukset generoitu uudelleen

Co-Authored-By: Claude Fable 5 <noreply@anthropic.com>
</commit_message>
<xml_diff>
--- a/downloads/bittibiomi-tyopaketti.docx
+++ b/downloads/bittibiomi-tyopaketti.docx
@@ -960,7 +960,7 @@
                 <w:sz w:val="19"/>
                 <w:szCs w:val="19"/>
               </w:rPr>
-              <w:t xml:space="preserve">Katselmointi · Asiakas kokeilee pakettiasi</w:t>
+              <w:t xml:space="preserve">Katselmointi · Ensimmäiset testaajat</w:t>
             </w:r>
           </w:p>
         </w:tc>
@@ -1851,7 +1851,7 @@
           <w:sz w:val="21"/>
           <w:szCs w:val="21"/>
         </w:rPr>
-        <w:t xml:space="preserve">☐  Perusta Git-repository, README, .gitignore ja kansiot resourcepack, datapack ja project-docs.</w:t>
+        <w:t xml:space="preserve">☐  Perusta julkinen Git-repository, README, .gitignore ja kansiot resourcepack, datapack ja project-docs.</w:t>
       </w:r>
     </w:p>
     <w:p>
@@ -1864,7 +1864,7 @@
           <w:sz w:val="19"/>
           <w:szCs w:val="19"/>
         </w:rPr>
-        <w:t xml:space="preserve">Valmis kun: Asiakkaan vastaukset, avoimet asiat ja oletukset on eroteltu. Toinen henkilö löytää repositoryn README:stä projektin tavoitteen, ja tyhjä paketti näkyy pelin pakettivalikossa.</w:t>
+        <w:t xml:space="preserve">Valmis kun: Ohjaajan vastaukset, avoimet asiat ja oletukset on eroteltu. Toinen henkilö löytää julkisen repositoryn README:stä projektin tavoitteen, ja tyhjä paketti näkyy pelin pakettivalikossa.</w:t>
       </w:r>
     </w:p>
     <w:p>
@@ -1877,7 +1877,7 @@
           <w:sz w:val="19"/>
           <w:szCs w:val="19"/>
         </w:rPr>
-        <w:t xml:space="preserve">Työnäyte Git-repositoryyn ennen rastia: asiakastarpeen muistiinpano, repository-linkki, ensimmäinen commit ja kuva paketista pelin valikossa.</w:t>
+        <w:t xml:space="preserve">Työnäyte Git-repositoryyn ennen rastia: toimeksiantokeskustelun muistiinpano, julkisen repositoryn linkki, ensimmäinen commit ja kuva paketista pelin valikossa.</w:t>
       </w:r>
     </w:p>
     <w:p>
@@ -1906,7 +1906,7 @@
           <w:sz w:val="21"/>
           <w:szCs w:val="21"/>
         </w:rPr>
-        <w:t xml:space="preserve">Viikon jälkeen paketti on paperilla: teema, väripaletti ja sisältölista tekojärjestyksessä. Asiakas on hyväksynyt rajauksen.</w:t>
+        <w:t xml:space="preserve">Viikon jälkeen paketti on paperilla: teema, väripaletti, lisenssi ja sisältölista tekojärjestyksessä. Ohjaaja on hyväksynyt rajauksen.</w:t>
       </w:r>
     </w:p>
     <w:p>
@@ -2375,7 +2375,7 @@
           <w:sz w:val="21"/>
           <w:szCs w:val="21"/>
         </w:rPr>
-        <w:t xml:space="preserve">Paketti saa äänen: oma tai luvallisesti hankittu ääni kuuluu pelissä.</w:t>
+        <w:t xml:space="preserve">Paketti saa äänen: oma tai uudelleenjulkaisun sallivalla lisenssillä hankittu ääni kuuluu pelissä.</w:t>
       </w:r>
     </w:p>
     <w:p>
@@ -2424,7 +2424,7 @@
           <w:sz w:val="19"/>
           <w:szCs w:val="19"/>
         </w:rPr>
-        <w:t xml:space="preserve">Valmis kun: Oma ääni kuuluu pelissä /playsound-komennolla, tekstitys näkyy ja äänen lähde sekä lisenssi on kirjattu README:hen.</w:t>
+        <w:t xml:space="preserve">Valmis kun: Oma ääni kuuluu pelissä /playsound-komennolla, tekstitys näkyy ja äänen lähde sekä lisenssi on kirjattu CREDITS-tiedostoon.</w:t>
       </w:r>
     </w:p>
     <w:p>
@@ -2451,7 +2451,7 @@
           <w:bCs/>
           <w:color w:val="1B5E20"/>
         </w:rPr>
-        <w:t xml:space="preserve">Vko 41 · 5.–9.10. — Katselmointi · Asiakas kokeilee pakettiasi</w:t>
+        <w:t xml:space="preserve">Vko 41 · 5.–9.10. — Katselmointi · Ensimmäiset testaajat</w:t>
       </w:r>
     </w:p>
     <w:p>
@@ -2466,7 +2466,7 @@
           <w:sz w:val="21"/>
           <w:szCs w:val="21"/>
         </w:rPr>
-        <w:t xml:space="preserve">Asiakas kokeilee pakettia ensimmäistä kertaa ja antaa palautteen. Yksi muutos sovitaan.</w:t>
+        <w:t xml:space="preserve">Ensimmäiset testaajat kokeilevat pakettia ja antavat palautteen. Yksi muutos sovitaan.</w:t>
       </w:r>
     </w:p>
     <w:p>
@@ -2490,7 +2490,7 @@
           <w:sz w:val="21"/>
           <w:szCs w:val="21"/>
         </w:rPr>
-        <w:t xml:space="preserve">☐  Anna asiakkaan (pelikerhon ohjaaja tai opettaja) pelata paketin kanssa, kerää palaute ja sovi yksi rajattu muutos.</w:t>
+        <w:t xml:space="preserve">☐  Anna ohjaajan ja yhden vertaistestaajan pelata paketin kanssa, kerää palaute ja sovi yksi rajattu muutos.</w:t>
       </w:r>
     </w:p>
     <w:p>
@@ -2515,7 +2515,7 @@
           <w:sz w:val="19"/>
           <w:szCs w:val="19"/>
         </w:rPr>
-        <w:t xml:space="preserve">Valmis kun: Asiakas on pelannut paketin kanssa. Muistiossa näkyvät alkuperäinen palaute, oma tulkinta, päätös, hyväksyjä ja yksi rajattu issue.</w:t>
+        <w:t xml:space="preserve">Valmis kun: Ohjaaja ja vertaistestaaja ovat pelanneet paketin kanssa. Muistiossa näkyvät alkuperäinen palaute, oma tulkinta, päätös, hyväksyjä ja yksi rajattu issue.</w:t>
       </w:r>
     </w:p>
     <w:p>
@@ -2597,19 +2597,19 @@
           <w:sz w:val="21"/>
           <w:szCs w:val="21"/>
         </w:rPr>
-        <w:t xml:space="preserve">Asiakkaan pyytämä muutos on pelissä, ja paketilla on nyt myös toimiva datapaketti.</w:t>
-      </w:r>
-    </w:p>
-    <w:p>
-      <w:pPr>
-        <w:spacing w:after="80" w:before="0"/>
-      </w:pPr>
-      <w:r>
-        <w:rPr>
-          <w:sz w:val="21"/>
-          <w:szCs w:val="21"/>
-        </w:rPr>
-        <w:t xml:space="preserve">☐  Muuta asiakkaan palaute pieniksi tehtäviksi ja toteuta sovittu muutos omassa feature-branchissa eli muutokselle rajatussa Git-haarassa.</w:t>
+        <w:t xml:space="preserve">Palautteessa pyydetty muutos on pelissä, ja paketilla on nyt myös toimiva datapaketti.</w:t>
+      </w:r>
+    </w:p>
+    <w:p>
+      <w:pPr>
+        <w:spacing w:after="80" w:before="0"/>
+      </w:pPr>
+      <w:r>
+        <w:rPr>
+          <w:sz w:val="21"/>
+          <w:szCs w:val="21"/>
+        </w:rPr>
+        <w:t xml:space="preserve">☐  Muuta saatu palaute pieniksi tehtäviksi ja toteuta sovittu muutos omassa feature-branchissa eli muutokselle rajatussa Git-haarassa.</w:t>
       </w:r>
     </w:p>
     <w:p>
@@ -2870,7 +2870,7 @@
           <w:sz w:val="21"/>
           <w:szCs w:val="21"/>
         </w:rPr>
-        <w:t xml:space="preserve">Paketti toimii kuten ennen, mutta rakenne on siisti ja jokainen tiedosto on luvallinen.</w:t>
+        <w:t xml:space="preserve">Paketti toimii kuten ennen, mutta rakenne on siisti ja jokainen tiedosto on lisenssiltään julkaisukelpoinen.</w:t>
       </w:r>
     </w:p>
     <w:p>
@@ -2906,7 +2906,7 @@
           <w:sz w:val="21"/>
           <w:szCs w:val="21"/>
         </w:rPr>
-        <w:t xml:space="preserve">☐  Tee käyttöoikeustarkistus: paketissa ei ole Mojangin eikä muiden materiaalia ilman lupaa, ja lähteet ja lisenssit ovat README:ssä.</w:t>
+        <w:t xml:space="preserve">☐  Tee lisenssitarkistus: lisää sovittu LICENSE-tiedosto ja CREDITS-tiedosto, ja varmista ettei paketissa ole Mojangin eikä muiden materiaalia ilman uudelleenjulkaisun sallivaa lisenssiä.</w:t>
       </w:r>
     </w:p>
     <w:p>
@@ -2919,7 +2919,7 @@
           <w:sz w:val="19"/>
           <w:szCs w:val="19"/>
         </w:rPr>
-        <w:t xml:space="preserve">Valmis kun: Sama testi menee läpi ennen siivousta ja sen jälkeen. Katselmointikommenttiin on vastattu, ja README listaa jokaisen ulkopuolisen lähteen lisensseineen — tai toteaa, että kaikki on itse tehtyä.</w:t>
+        <w:t xml:space="preserve">Valmis kun: Sama testi menee läpi ennen siivousta ja sen jälkeen. Katselmointikommenttiin on vastattu, LICENSE on repositoryn juuressa ja CREDITS listaa jokaisen ulkopuolisen lähteen lisensseineen — tai toteaa, että kaikki on itse tehtyä.</w:t>
       </w:r>
     </w:p>
     <w:p>
@@ -2932,7 +2932,7 @@
           <w:sz w:val="19"/>
           <w:szCs w:val="19"/>
         </w:rPr>
-        <w:t xml:space="preserve">Työnäyte Git-repositoryyn ennen rastia: katselmointimuistio, siivouscommit ja käyttöoikeustarkistuksen kirjaus.</w:t>
+        <w:t xml:space="preserve">Työnäyte Git-repositoryyn ennen rastia: katselmointimuistio, siivouscommit sekä LICENSE- ja CREDITS-tiedostot.</w:t>
       </w:r>
     </w:p>
     <w:p>
@@ -2999,7 +2999,7 @@
           <w:sz w:val="21"/>
           <w:szCs w:val="21"/>
         </w:rPr>
-        <w:t xml:space="preserve">☐  Anna asiakkaan ja vähintään yhden muun käyttäjän asentaa ja testata paketti pelkän ohjeen avulla. Jos teet yksin, toinen testaaja voi olla toisen ryhmän opiskelija tai ohjaaja.</w:t>
+        <w:t xml:space="preserve">☐  Anna ohjaajan ja vähintään yhden muun käyttäjän asentaa ja testata paketti pelkän ohjeen avulla. Jos et löydä toista testaajaa omasta ryhmästä, hän voi olla toisen ryhmän opiskelija tai toinen ohjaaja.</w:t>
       </w:r>
     </w:p>
     <w:p>
@@ -3024,7 +3024,7 @@
           <w:sz w:val="19"/>
           <w:szCs w:val="19"/>
         </w:rPr>
-        <w:t xml:space="preserve">Valmis kun: RC1 on sidottu yhteen committiin. Asiakas ja toinen käyttäjä ovat asentaneet paketin pelkän ohjeen avulla, ja jokaisella havainnolla on vakavuus, toistettavuus ja päätös.</w:t>
+        <w:t xml:space="preserve">Valmis kun: RC1 on sidottu yhteen committiin. Ohjaaja ja toinen käyttäjä ovat asentaneet paketin pelkän ohjeen avulla, ja jokaisella havainnolla on vakavuus, toistettavuus ja päätös.</w:t>
       </w:r>
     </w:p>
     <w:p>
@@ -3066,7 +3066,7 @@
           <w:sz w:val="21"/>
           <w:szCs w:val="21"/>
         </w:rPr>
-        <w:t xml:space="preserve">Paketti on julkaistu. Kerholainen lataa ja asentaa sen itse ohjeen avulla.</w:t>
+        <w:t xml:space="preserve">Paketti on julkaistu avoimella lisenssillä. Kuka tahansa lataa ja asentaa sen itse ohjeen avulla.</w:t>
       </w:r>
     </w:p>
     <w:p>
@@ -3090,7 +3090,7 @@
           <w:sz w:val="21"/>
           <w:szCs w:val="21"/>
         </w:rPr>
-        <w:t xml:space="preserve">☐  Tee v1.0-tagi ja julkaise GitHub-release: zip-paketit, README, kuvakaappaukset ja asennusohje. Valinnainen bonus: julkaise lisäksi Modrinthissa tai Planet Minecraftissa opettajan kanssa sovitusti.</w:t>
+        <w:t xml:space="preserve">☐  Tee v1.0-tagi ja julkaise GitHub-release: zip-paketit, README, LICENSE, CHANGELOG, kuvakaappaukset ja asennusohje. Valinnainen bonus: julkaise lisäksi Modrinthissa tai Planet Minecraftissa opettajan kanssa sovitusti.</w:t>
       </w:r>
     </w:p>
     <w:p>
@@ -3524,19 +3524,19 @@
           <w:sz w:val="19"/>
           <w:szCs w:val="19"/>
         </w:rPr>
-        <w:t xml:space="preserve">☐  Asiakkaan tarpeet — Kysymyslista ja aloitusmuistio.</w:t>
-      </w:r>
-    </w:p>
-    <w:p>
-      <w:pPr>
-        <w:spacing w:after="60" w:before="0"/>
-      </w:pPr>
-      <w:r>
-        <w:rPr>
-          <w:sz w:val="19"/>
-          <w:szCs w:val="19"/>
-        </w:rPr>
-        <w:t xml:space="preserve">☐  Asiakaslähtöinen viestintä — Ymmärrettävä yhteenveto vaihtoehdoista ja rajoista.</w:t>
+        <w:t xml:space="preserve">☐  Asiakkaan tarpeet — Kysymyslista ohjaajalle, aloitusmuistio ja kuvaus paketin kohdeyleisöstä.</w:t>
+      </w:r>
+    </w:p>
+    <w:p>
+      <w:pPr>
+        <w:spacing w:after="60" w:before="0"/>
+      </w:pPr>
+      <w:r>
+        <w:rPr>
+          <w:sz w:val="19"/>
+          <w:szCs w:val="19"/>
+        </w:rPr>
+        <w:t xml:space="preserve">☐  Asiakaslähtöinen viestintä — Ymmärrettävä yhteenveto vaihtoehdoista ja rajoista sekä lataajalle kirjoitettu README ja asennusohje.</w:t>
       </w:r>
     </w:p>
     <w:p>
@@ -3644,7 +3644,7 @@
           <w:sz w:val="19"/>
           <w:szCs w:val="19"/>
         </w:rPr>
-        <w:t xml:space="preserve">☐  Tietoturva — Lisenssit, luotettavat lataukset ja se, ettei paketissa ole henkilötietoja tai salaisuuksia.</w:t>
+        <w:t xml:space="preserve">☐  Tietoturva — Oma lisenssi ja kolmansien osapuolten lisenssit, luotettavat lataukset ja se, ettei julkisessa repositoryssa ole henkilötietoja tai salaisuuksia.</w:t>
       </w:r>
     </w:p>
     <w:p>
@@ -3766,19 +3766,19 @@
           <w:sz w:val="19"/>
           <w:szCs w:val="19"/>
         </w:rPr>
-        <w:t xml:space="preserve">☐  Julkaisu asiakkaan ympäristöön — GitHub-release asennettuna kerhon peliin; asiakas on kokeillut julkaistua pakettia.</w:t>
-      </w:r>
-    </w:p>
-    <w:p>
-      <w:pPr>
-        <w:spacing w:after="60" w:before="0"/>
-      </w:pPr>
-      <w:r>
-        <w:rPr>
-          <w:sz w:val="19"/>
-          <w:szCs w:val="19"/>
-        </w:rPr>
-        <w:t xml:space="preserve">☐  Ohjelmiston dokumentointi — README, asennusohje, asset-pack-suunnitelma.md ja projektipäiväkirja project-docs-kansiossa.</w:t>
+        <w:t xml:space="preserve">☐  Julkaisu asiakkaan ympäristöön — Julkinen GitHub-release, jonka toinen henkilö on asentanut peliinsä pelkän ohjeen avulla.</w:t>
+      </w:r>
+    </w:p>
+    <w:p>
+      <w:pPr>
+        <w:spacing w:after="60" w:before="0"/>
+      </w:pPr>
+      <w:r>
+        <w:rPr>
+          <w:sz w:val="19"/>
+          <w:szCs w:val="19"/>
+        </w:rPr>
+        <w:t xml:space="preserve">☐  Ohjelmiston dokumentointi — README, asennusohje, LICENSE, CREDITS, asset-pack-suunnitelma.md ja projektipäiväkirja.</w:t>
       </w:r>
     </w:p>
     <w:p>

</xml_diff>

<commit_message>
Linnean kierros 3: lisenssiketju, yksityisyys ja puuttuvat todisteet
- repositoryn näkyvyys pois avoimista asioista (ristiriita tehtävän 34-3 kanssa)
- vko 34: mitä julkiseen repoon ei laiteta, tekijänimi ja huoltajasopiminen
- vko 34: kahden julkaistun paketin tutkiminen kohdeyleisön ankkuriksi
- LICENSE yhtenäisesti vkolle 35, vko 46 on tarkistus
- vko 46: palautettu AI-kritiikkiaskel, joka jäi lisenssiaskeleen alle
- vko 46: lisenssin ymmärrys omasta LICENSE-tiedostosta, jatkettavuus done-ehtoon
- vko 40: README to CREDITS myös rasteissa; lisenssin kaksi suuntaa nimetty
- vko 41: 5-10 min esittely ohjeisiin ja todisteisiin
- vko 48: uusi tehtava 48-4, ulkopuolinen asentaa julkaistun v1.0:n
- malliesimerkki ilman kerhoa; yksityisyysohje myos paperiseen tyopakettiin

Co-Authored-By: Claude Fable 5 <noreply@anthropic.com>
</commit_message>
<xml_diff>
--- a/downloads/bittibiomi-tyopaketti.docx
+++ b/downloads/bittibiomi-tyopaketti.docx
@@ -72,6 +72,20 @@
           <w:szCs w:val="21"/>
         </w:rPr>
         <w:t xml:space="preserve">Tämä paketti on aikataulu ja tarkistuslista tilanteisiin, joissa sivusto ei ole auki. Projektipäiväkirja kirjoitetaan sivustolla ja viedään repositorion project-docs-kansioon. Rasti tässä vihossa ei ole palautus — työnäyte on aina Git-repositoryssa.</w:t>
+      </w:r>
+    </w:p>
+    <w:p>
+      <w:pPr>
+        <w:spacing w:after="120" w:before="200"/>
+        <w:jc w:val="center"/>
+      </w:pPr>
+      <w:r>
+        <w:rPr>
+          <w:color w:val="555555"/>
+          <w:sz w:val="21"/>
+          <w:szCs w:val="21"/>
+        </w:rPr>
+        <w:t xml:space="preserve">Paketti julkaistaan avoimella lisenssillä ja repository on julkinen ensimmäisestä commitista. Älä laita julkiseen repositoryyn henkilötietoja, kotiosoitetta, koulun tunnisteita tai muiden nimiä — Git-historia on pysyvä. Sovi tekijänimi ohjaajan kanssa, ja alaikäisenä sovi julkisesta repositorystä myös huoltajan kanssa.</w:t>
       </w:r>
     </w:p>
     <w:p>
@@ -1827,7 +1841,7 @@
           <w:sz w:val="21"/>
           <w:szCs w:val="21"/>
         </w:rPr>
-        <w:t xml:space="preserve">☐  Lue toimeksianto, laadi vähintään 8 kysymystä ja pidä aloituskeskustelu.</w:t>
+        <w:t xml:space="preserve">☐  Lue toimeksianto, laadi vähintään 8 kysymystä ja pidä aloituskeskustelu. Tutki lisäksi kaksi jo julkaistua teemapakettia ja kirjaa, mitä ne tekevät ja mitä sinun pakettisi tekee toisin.</w:t>
       </w:r>
     </w:p>
     <w:p>
@@ -1851,7 +1865,7 @@
           <w:sz w:val="21"/>
           <w:szCs w:val="21"/>
         </w:rPr>
-        <w:t xml:space="preserve">☐  Perusta julkinen Git-repository, README, .gitignore ja kansiot resourcepack, datapack ja project-docs.</w:t>
+        <w:t xml:space="preserve">☐  Käy läpi, mitä julkiseen repositoryyn ei laiteta, sovi tekijänimi ja perusta sitten julkinen Git-repository: README, .gitignore ja kansiot resourcepack, datapack ja project-docs.</w:t>
       </w:r>
     </w:p>
     <w:p>
@@ -2399,7 +2413,7 @@
           <w:sz w:val="21"/>
           <w:szCs w:val="21"/>
         </w:rPr>
-        <w:t xml:space="preserve">☐  Kirjaa äänen lähde ja lisenssi README:hen; älä käytä materiaalia ilman lupaa.</w:t>
+        <w:t xml:space="preserve">☐  Kirjaa äänen lähde ja lisenssi CREDITS-tiedostoon; käytä vain materiaalia, jonka lisenssi sallii uudelleenjulkaisun.</w:t>
       </w:r>
     </w:p>
     <w:p>
@@ -2437,7 +2451,7 @@
           <w:sz w:val="19"/>
           <w:szCs w:val="19"/>
         </w:rPr>
-        <w:t xml:space="preserve">Työnäyte Git-repositoryyn ennen rastia: sounds.json-commit, lisenssikirjaus README:ssä ja testimerkintä.</w:t>
+        <w:t xml:space="preserve">Työnäyte Git-repositoryyn ennen rastia: sounds.json-commit, lisenssikirjaus CREDITS-tiedostossa ja testimerkintä.</w:t>
       </w:r>
     </w:p>
     <w:p>
@@ -2528,7 +2542,7 @@
           <w:sz w:val="19"/>
           <w:szCs w:val="19"/>
         </w:rPr>
-        <w:t xml:space="preserve">Työnäyte Git-repositoryyn ennen rastia: katselmointiloki, palaute, päätetty muutos ja toimiva väliversio-zip.</w:t>
+        <w:t xml:space="preserve">Työnäyte Git-repositoryyn ennen rastia: katselmointiloki, esittelyn runko, palaute, päätetty muutos ja toimiva väliversio-zip.</w:t>
       </w:r>
     </w:p>
     <w:p>
@@ -2906,7 +2920,7 @@
           <w:sz w:val="21"/>
           <w:szCs w:val="21"/>
         </w:rPr>
-        <w:t xml:space="preserve">☐  Tee lisenssitarkistus: lisää sovittu LICENSE-tiedosto ja CREDITS-tiedosto, ja varmista ettei paketissa ole Mojangin eikä muiden materiaalia ilman uudelleenjulkaisun sallivaa lisenssiä.</w:t>
+        <w:t xml:space="preserve">☐  Tee lisenssitarkistus: varmista että LICENSE on repositoryn juuressa ja vastaa sovittua, täydennä CREDITS ja tarkista, ettei paketissa ole Mojangin eikä muiden materiaalia ilman uudelleenjulkaisun sallivaa lisenssiä. Vastaa oman LICENSE-tiedostosi tekstin perusteella: saako toinen pelaaja julkaista muokatun version paketistasi, ja mitä hänen pitää tehdä?</w:t>
       </w:r>
     </w:p>
     <w:p>
@@ -2919,7 +2933,7 @@
           <w:sz w:val="19"/>
           <w:szCs w:val="19"/>
         </w:rPr>
-        <w:t xml:space="preserve">Valmis kun: Sama testi menee läpi ennen siivousta ja sen jälkeen. Katselmointikommenttiin on vastattu, LICENSE on repositoryn juuressa ja CREDITS listaa jokaisen ulkopuolisen lähteen lisensseineen — tai toteaa, että kaikki on itse tehtyä.</w:t>
+        <w:t xml:space="preserve">Valmis kun: Sama testi menee läpi ennen siivousta ja sen jälkeen. Katselmointikommenttiin on vastattu, LICENSE on repositoryn juuressa ja vastaa sovittua, ja CREDITS listaa jokaisen ulkopuolisen lähteen lisensseineen — tai toteaa, että kaikki on itse tehtyä. Katselmoija pystyy myös osoittamaan, mihin uusi tekstuuri lisättäisiin ja mistä lähdetiedostot kuten .bbmodel löytyvät: silloin toinen tekijä voi jatkaa työtä.</w:t>
       </w:r>
     </w:p>
     <w:p>
@@ -3102,7 +3116,19 @@
           <w:sz w:val="21"/>
           <w:szCs w:val="21"/>
         </w:rPr>
-        <w:t xml:space="preserve">☐  Testaa julkaistu lataus toisella koneella tai puhtaalla pelillä ja viimeistele käyttöohje.</w:t>
+        <w:t xml:space="preserve">☐  Testaa julkaistu lataus itse toisella koneella tai puhtaalla pelillä ja viimeistele käyttöohje.</w:t>
+      </w:r>
+    </w:p>
+    <w:p>
+      <w:pPr>
+        <w:spacing w:after="80" w:before="0"/>
+      </w:pPr>
+      <w:r>
+        <w:rPr>
+          <w:sz w:val="21"/>
+          <w:szCs w:val="21"/>
+        </w:rPr>
+        <w:t xml:space="preserve">☐  Pyydä yksi henkilö, joka ei ole tekijä, asentamaan julkaistu v1.0 release-sivulta pelkän ohjeen avulla. Kirjaa hänen roolinsa, päivä ja havainnot.</w:t>
       </w:r>
     </w:p>
     <w:p>
@@ -3128,7 +3154,7 @@
           <w:sz w:val="19"/>
           <w:szCs w:val="19"/>
         </w:rPr>
-        <w:t xml:space="preserve">Työnäyte Git-repositoryyn ennen rastia: toimiva release-linkki, v1.0-tagi, asennusohje ja tunnetut puutteet.</w:t>
+        <w:t xml:space="preserve">Työnäyte Git-repositoryyn ennen rastia: toimiva release-linkki, v1.0-tagi, asennusohje, ulkopuolisen asennustestin kirjaus ja tunnetut puutteet.</w:t>
       </w:r>
     </w:p>
     <w:p>
@@ -3742,7 +3768,7 @@
           <w:sz w:val="19"/>
           <w:szCs w:val="19"/>
         </w:rPr>
-        <w:t xml:space="preserve">☐  Ulkoiset komponentit — Paletit, äänet ja referenssit tuotuina; lähteet ja lisenssit kirjattu Asset-pack-suunnitelmaan tai README:hen.</w:t>
+        <w:t xml:space="preserve">☐  Ulkoiset komponentit — Paletit, äänet ja referenssit tuotuina; lähteet ja lisenssit kirjattu CREDITS-tiedostoon.</w:t>
       </w:r>
     </w:p>
     <w:p>

</xml_diff>

<commit_message>
Linnean kierros 4: kosmeettiset viimeistelyt
Staattinen tehtavalaskuri 47, LICENSE vkon 35 done-ehtoon ja
naytto­riviin, linkit tutkittuihin paketteihin vkon 34 naytto­riviin.

Co-Authored-By: Claude Fable 5 <noreply@anthropic.com>
</commit_message>
<xml_diff>
--- a/downloads/bittibiomi-tyopaketti.docx
+++ b/downloads/bittibiomi-tyopaketti.docx
@@ -1891,7 +1891,7 @@
           <w:sz w:val="19"/>
           <w:szCs w:val="19"/>
         </w:rPr>
-        <w:t xml:space="preserve">Työnäyte Git-repositoryyn ennen rastia: toimeksiantokeskustelun muistiinpano, julkisen repositoryn linkki, ensimmäinen commit ja kuva paketista pelin valikossa.</w:t>
+        <w:t xml:space="preserve">Työnäyte Git-repositoryyn ennen rastia: toimeksiantokeskustelun muistiinpano, linkit kahteen tutkittuun pakettiin havaintoineen, julkisen repositoryn linkki, ensimmäinen commit ja kuva paketista pelin valikossa.</w:t>
       </w:r>
     </w:p>
     <w:p>
@@ -1969,7 +1969,7 @@
           <w:sz w:val="19"/>
           <w:szCs w:val="19"/>
         </w:rPr>
-        <w:t xml:space="preserve">Valmis kun: Pakollinen perusversio on hyväksytty. Jokaisella P0-tehtävällä on 0,5–1 päivän arvio ja havaittava valmis kun -ehto. Moodboardissa näkyvät paletti ja referenssit.</w:t>
+        <w:t xml:space="preserve">Valmis kun: Pakollinen perusversio on hyväksytty. Jokaisella P0-tehtävällä on 0,5–1 päivän arvio ja havaittava valmis kun -ehto. Moodboardissa näkyvät paletti ja referenssit, ja sovittu LICENSE-tiedosto on repositoryn juuressa.</w:t>
       </w:r>
     </w:p>
     <w:p>
@@ -1982,7 +1982,7 @@
           <w:sz w:val="19"/>
           <w:szCs w:val="19"/>
         </w:rPr>
-        <w:t xml:space="preserve">Työnäyte Git-repositoryyn ennen rastia: hyväksytty rajaus, päivätty moodboard, asset-pack-suunnitelma.md ja backlog.</w:t>
+        <w:t xml:space="preserve">Työnäyte Git-repositoryyn ennen rastia: hyväksytty rajaus, päivätty moodboard, asset-pack-suunnitelma.md, LICENSE-tiedosto repositoryn juuressa ja backlog.</w:t>
       </w:r>
     </w:p>
     <w:p>

</xml_diff>

<commit_message>
Vahvistettu vaatimusmäppäys: näyttösuunnitelma ja roolien täsmennys
Mäppäys vahvistettu: samat kolme tutkinnon osaa, tyonaytteet mapattu
viikoittain. Uusi nayttosuunnitelma.docx (8 osiota, 32 arviointikohdetta
viikkomappayksella, laadun tarkistuspisteet, huomiot opettajalle).

Roolit tasmennetty: toimeksianto tulee ohjaajalta, joka paattaa
lisenssista ja oppilaitoksen linjasta, tarkistaa laadun ja antaa
palautetta - ei ole paketin kayttaja. Dokumentaatio (README,
asennusohje, LICENSE, CREDITS, CHANGELOG) kirjoitetaan lataajalle;
arviointiaineisto on erillinen.

Co-Authored-By: Claude Fable 5 <noreply@anthropic.com>
</commit_message>
<xml_diff>
--- a/downloads/bittibiomi-tyopaketti.docx
+++ b/downloads/bittibiomi-tyopaketti.docx
@@ -2492,7 +2492,7 @@
           <w:sz w:val="21"/>
           <w:szCs w:val="21"/>
         </w:rPr>
-        <w:t xml:space="preserve">☐  Kokoa kokeiltava väliversio (zip) ja kirjallinen asennusohje sekä valmistele 5–10 minuutin esittely.</w:t>
+        <w:t xml:space="preserve">☐  Kokoa kokeiltava väliversio (zip) ja lataajalle kirjoitettu asennusohje sekä valmistele 5–10 minuutin esittely.</w:t>
       </w:r>
     </w:p>
     <w:p>
@@ -2908,7 +2908,7 @@
           <w:sz w:val="21"/>
           <w:szCs w:val="21"/>
         </w:rPr>
-        <w:t xml:space="preserve">☐  Pyydä katselmointi ohjaajalta tai vertaiselta ja kirjaa palaute.</w:t>
+        <w:t xml:space="preserve">☐  Pyydä laatukatselmointi ohjaajalta tai vertaiselta ja kirjaa palaute.</w:t>
       </w:r>
     </w:p>
     <w:p>
@@ -3001,7 +3001,7 @@
           <w:sz w:val="21"/>
           <w:szCs w:val="21"/>
         </w:rPr>
-        <w:t xml:space="preserve">☐  Kokoa release candidate (RC1): zip-paketit ja asennusohje. Jäädytä uuden sisällön lisääminen.</w:t>
+        <w:t xml:space="preserve">☐  Kokoa release candidate (RC1): zip-paketit ja lataajalle kirjoitettu asennusohje. Jäädytä uuden sisällön lisääminen.</w:t>
       </w:r>
     </w:p>
     <w:p>
@@ -3804,7 +3804,7 @@
           <w:sz w:val="19"/>
           <w:szCs w:val="19"/>
         </w:rPr>
-        <w:t xml:space="preserve">☐  Ohjelmiston dokumentointi — README, asennusohje, LICENSE, CREDITS, asset-pack-suunnitelma.md ja projektipäiväkirja.</w:t>
+        <w:t xml:space="preserve">☐  Ohjelmiston dokumentointi — Lataajalle: README, asennusohje, LICENSE, CREDITS ja CHANGELOG. Arviointiin: asset-pack-suunnitelma.md ja projektipäiväkirja.</w:t>
       </w:r>
     </w:p>
     <w:p>

</xml_diff>